<commit_message>
data overview functionality (lacks data manipulation)
</commit_message>
<xml_diff>
--- a/Design/(1) ui_overview.docx
+++ b/Design/(1) ui_overview.docx
@@ -96,6 +96,7 @@
         <w:rPr>
           <w:b/>
           <w:bCs/>
+          <w:noProof/>
           <w:sz w:val="24"/>
           <w:szCs w:val="24"/>
           <w:lang w:val="en-US"/>
@@ -290,7 +291,21 @@
         <w:rPr>
           <w:lang w:val="en-US"/>
         </w:rPr>
-        <w:t>The reason for the space on each side of the content is to help focus the information on one area of the screen. This is done by ensuring a max-width:1200px of the content, meaning this remains consistent so long as the screen width is greater than 1200px, and remains functional by resizing otherwise.</w:t>
+        <w:t xml:space="preserve">The reason for the space on each side of the content is to help focus the information on one area of the screen. This is done by ensuring a </w:t>
+      </w:r>
+      <w:proofErr w:type="gramStart"/>
+      <w:r>
+        <w:rPr>
+          <w:lang w:val="en-US"/>
+        </w:rPr>
+        <w:t>max-width</w:t>
+      </w:r>
+      <w:proofErr w:type="gramEnd"/>
+      <w:r>
+        <w:rPr>
+          <w:lang w:val="en-US"/>
+        </w:rPr>
+        <w:t>:1200px of the content, meaning this remains consistent so long as the screen width is greater than 1200px, and remains functional by resizing otherwise.</w:t>
       </w:r>
     </w:p>
     <w:p>
@@ -428,6 +443,7 @@
         <w:rPr>
           <w:b/>
           <w:bCs/>
+          <w:noProof/>
           <w:sz w:val="24"/>
           <w:szCs w:val="24"/>
           <w:lang w:val="en-US"/>
@@ -525,11 +541,6 @@
     </w:p>
     <w:p>
       <w:pPr>
-        <w:pStyle w:val="ListParagraph"/>
-        <w:numPr>
-          <w:ilvl w:val="1"/>
-          <w:numId w:val="1"/>
-        </w:numPr>
         <w:rPr>
           <w:b/>
           <w:bCs/>
@@ -546,11 +557,9 @@
           <w:szCs w:val="24"/>
           <w:lang w:val="en-US"/>
         </w:rPr>
-        <w:t>Loading indicator (WIP)</w:t>
-      </w:r>
-    </w:p>
-    <w:p>
-      <w:pPr>
+        <w:t>1.4 After parsing replays</w:t>
+      </w:r>
+      <w:r>
         <w:rPr>
           <w:b/>
           <w:bCs/>
@@ -558,25 +567,6 @@
           <w:szCs w:val="24"/>
           <w:lang w:val="en-US"/>
         </w:rPr>
-      </w:pPr>
-      <w:r>
-        <w:rPr>
-          <w:b/>
-          <w:bCs/>
-          <w:sz w:val="24"/>
-          <w:szCs w:val="24"/>
-          <w:lang w:val="en-US"/>
-        </w:rPr>
-        <w:t>1.4 After parsing replays</w:t>
-      </w:r>
-      <w:r>
-        <w:rPr>
-          <w:b/>
-          <w:bCs/>
-          <w:sz w:val="24"/>
-          <w:szCs w:val="24"/>
-          <w:lang w:val="en-US"/>
-        </w:rPr>
         <w:t xml:space="preserve"> (Data Overview)</w:t>
       </w:r>
     </w:p>
@@ -592,6 +582,7 @@
         <w:rPr>
           <w:b/>
           <w:bCs/>
+          <w:noProof/>
           <w:lang w:val="en-US"/>
         </w:rPr>
         <w:drawing>
@@ -739,6 +730,7 @@
       </w:pPr>
       <w:r>
         <w:rPr>
+          <w:noProof/>
           <w:lang w:val="en-US"/>
         </w:rPr>
         <w:drawing>
@@ -912,6 +904,7 @@
         <w:rPr>
           <w:b/>
           <w:bCs/>
+          <w:noProof/>
           <w:sz w:val="24"/>
           <w:szCs w:val="24"/>
           <w:lang w:val="en-US"/>
@@ -1132,6 +1125,7 @@
       </w:pPr>
       <w:r>
         <w:rPr>
+          <w:noProof/>
           <w:lang w:val="en-US"/>
         </w:rPr>
         <w:drawing>
@@ -1297,6 +1291,7 @@
       </w:pPr>
       <w:r>
         <w:rPr>
+          <w:noProof/>
           <w:lang w:val="en-US"/>
         </w:rPr>
         <w:drawing>

</xml_diff>